<commit_message>
Finish documenting the phone/SMS OTP drop; sync all docx to md
SRS, the auth doc, the storefront manual, and the DFD had md-only
edits pending from commit a29e0cf (phone/SMS was dropped from the
registration gate) because their .docx counterparts were open in a
desktop word processor at the time. That file is now closed, so
regenerate every docs/*.docx from its .md via md_to_docx.py --all —
this also catches a few files whose .docx had drifted from earlier
sessions where the same lock issue applied.

Co-Authored-By: Claude Sonnet 5 <noreply@anthropic.com>
</commit_message>
<xml_diff>
--- a/docs/05-frontend-architecture.docx
+++ b/docs/05-frontend-architecture.docx
@@ -866,7 +866,7 @@
         <w:t>OtpVerify</w:t>
       </w:r>
       <w:r>
-        <w:t xml:space="preserve"> (the two-channel email/phone code-entry step </w:t>
+        <w:t xml:space="preserve"> (the email code-entry step </w:t>
       </w:r>
       <w:r>
         <w:rPr>
@@ -876,7 +876,7 @@
         <w:t>register()</w:t>
       </w:r>
       <w:r>
-        <w:t xml:space="preserve">'s registration-OTP hard gate requires before an account can log in — see </w:t>
+        <w:t xml:space="preserve">'s registration-OTP hard gate requires before an account can log in — phone/SMS verification is temporarily dropped from this gate, see </w:t>
       </w:r>
       <w:hyperlink r:id="rId9">
         <w:r>

</xml_diff>